<commit_message>
Update NKP Ubuntu bastion prerequisites runbook
</commit_message>
<xml_diff>
--- a/docs/NKP_2.18_Ubuntu_24.04_Air_Gapped_Bastion_Prerequisites_Runbook.docx
+++ b/docs/NKP_2.18_Ubuntu_24.04_Air_Gapped_Bastion_Prerequisites_Runbook.docx
@@ -206,14 +206,7 @@
                 <w:color w:val="0B2545"/>
                 <w:sz w:val="19"/>
               </w:rPr>
-              <w:t xml:space="preserve">Ubuntu Server </w:t>
-            </w:r>
-            <w:r>
-              <w:rPr>
-                <w:color w:val="0B2545"/>
-                <w:sz w:val="19"/>
-              </w:rPr>
-              <w:t>24.04 LTS, AMD64</w:t>
+              <w:t>Ubuntu Server 24.04 LTS, AMD64</w:t>
             </w:r>
           </w:p>
         </w:tc>
@@ -370,13 +363,7 @@
         <w:rPr>
           <w:color w:val="0B2545"/>
         </w:rPr>
-        <w:t>kubectl v1.32.7 is used in this runbook. Confirm it is within one minor version of the Kubernetes API serve</w:t>
-      </w:r>
-      <w:r>
-        <w:rPr>
-          <w:color w:val="0B2545"/>
-        </w:rPr>
-        <w:t>r selected for the exact NKP 2.18 patch before site execution.</w:t>
+        <w:t>kubectl v1.32.7 is used in this runbook. Confirm it is within one minor version of the Kubernetes API server selected for the exact NKP 2.18 patch before site execution.</w:t>
       </w:r>
     </w:p>
     <w:p>
@@ -389,18 +376,12 @@
     </w:p>
     <w:p>
       <w:r>
-        <w:t xml:space="preserve">This runbook documents the complete manual procedure used to prepare prerequisite software on an Internet-connected Mac and install it on a disconnected Ubuntu 24.04 AMD64 </w:t>
-      </w:r>
-      <w:r>
-        <w:t>Bastion VM. It covers Docker Engine, its local dependency repository, kubectl, Nano, jq, unzip, certificates, checksum verification, single-archive transfer, offline installation, and acceptance checks.</w:t>
-      </w:r>
-    </w:p>
-    <w:p>
-      <w:r>
-        <w:t>The dark-site Bastion must not be temporarily connect</w:t>
-      </w:r>
-      <w:r>
-        <w:t>ed to the Internet. All artifacts are downloaded outside the customer environment, validated, transferred through the approved security process, and installed from a file-based APT repository.</w:t>
+        <w:t>This runbook documents the complete manual procedure used to prepare prerequisite software on an Internet-connected Mac and install it on a disconnected Ubuntu 24.04 AMD64 Bastion VM. It covers Docker Engine, its local dependency repository, kubectl, Nano, jq, unzip, certificates, checksum verification, single-archive transfer, offline installation, and acceptance checks.</w:t>
+      </w:r>
+    </w:p>
+    <w:p>
+      <w:r>
+        <w:t>The dark-site Bastion must not be temporarily connected to the Internet. All artifacts are downloaded outside the customer environment, validated, transferred through the approved security process, and installed from a file-based APT repository.</w:t>
       </w:r>
     </w:p>
     <w:p>
@@ -923,14 +904,7 @@
                 <w:color w:val="0B2545"/>
                 <w:sz w:val="19"/>
               </w:rPr>
-              <w:t xml:space="preserve">Docker </w:t>
-            </w:r>
-            <w:r>
-              <w:rPr>
-                <w:color w:val="0B2545"/>
-                <w:sz w:val="19"/>
-              </w:rPr>
-              <w:t>Compose</w:t>
+              <w:t>Docker Compose</w:t>
             </w:r>
           </w:p>
         </w:tc>
@@ -1235,13 +1209,7 @@
         <w:rPr>
           <w:color w:val="0B2545"/>
         </w:rPr>
-        <w:t xml:space="preserve">The Docker </w:t>
-      </w:r>
-      <w:r>
-        <w:rPr>
-          <w:color w:val="0B2545"/>
-        </w:rPr>
-        <w:t>packages are deliberately version-aligned. Do not substitute current Docker 29.x companion packages into the Docker 27.4.0 bundle without Nutanix qualification.</w:t>
+        <w:t>The Docker packages are deliberately version-aligned. Do not substitute current Docker 29.x companion packages into the Docker 27.4.0 bundle without Nutanix qualification.</w:t>
       </w:r>
     </w:p>
     <w:p>
@@ -1261,10 +1229,7 @@
         <w:spacing w:after="80"/>
       </w:pPr>
       <w:r>
-        <w:t xml:space="preserve">Connected Mac: runs Docker Desktop and hosts a temporary Ubuntu 24.04 AMD64 </w:t>
-      </w:r>
-      <w:r>
-        <w:t>download container.</w:t>
+        <w:t>Connected Mac: runs Docker Desktop and hosts a temporary Ubuntu 24.04 AMD64 download container.</w:t>
       </w:r>
     </w:p>
     <w:p>
@@ -1300,10 +1265,7 @@
         <w:spacing w:after="80"/>
       </w:pPr>
       <w:r>
-        <w:t xml:space="preserve">Dark-site Bastion: verifies the archive and </w:t>
-      </w:r>
-      <w:r>
-        <w:t>installs only from local files.</w:t>
+        <w:t>Dark-site Bastion: verifies the archive and installs only from local files.</w:t>
       </w:r>
     </w:p>
     <w:tbl>
@@ -1771,10 +1733,7 @@
         <w:shd w:val="clear" w:color="auto" w:fill="F2F4F7"/>
       </w:pPr>
       <w:r>
-        <w:t xml:space="preserve">docker </w:t>
-      </w:r>
-      <w:r>
-        <w:t>info</w:t>
+        <w:t>docker info</w:t>
       </w:r>
     </w:p>
     <w:p>
@@ -1827,10 +1786,7 @@
         <w:shd w:val="clear" w:color="auto" w:fill="F2F4F7"/>
       </w:pPr>
       <w:r>
-        <w:t>docker run --rm --platform linux/amd64 ubuntu:2</w:t>
-      </w:r>
-      <w:r>
-        <w:t>4.04 dpkg --print-architecture</w:t>
+        <w:t>docker run --rm --platform linux/amd64 ubuntu:24.04 dpkg --print-architecture</w:t>
       </w:r>
     </w:p>
     <w:p>
@@ -1888,10 +1844,7 @@
         <w:shd w:val="clear" w:color="auto" w:fill="F2F4F7"/>
       </w:pPr>
       <w:r>
-        <w:t xml:space="preserve">mkdir -p </w:t>
-      </w:r>
-      <w:r>
-        <w:t>"$HOME/Downloads/nkp-offline/docker-debs" "$HOME/Downloads/nkp-offline/kubectl"</w:t>
+        <w:t>mkdir -p "$HOME/Downloads/nkp-offline/docker-debs" "$HOME/Downloads/nkp-offline/kubectl"</w:t>
       </w:r>
     </w:p>
     <w:p>
@@ -1930,18 +1883,11 @@
       </w:r>
       <w:r>
         <w:br/>
-      </w:r>
-      <w:r>
         <w:t xml:space="preserve">  -v "$HOME/Downloads/nkp-offline/docker-debs:/packages" \</w:t>
       </w:r>
       <w:r>
         <w:br/>
-      </w:r>
-      <w:r>
-        <w:t xml:space="preserve">  ubuntu:24.04 b</w:t>
-      </w:r>
-      <w:r>
-        <w:t>ash</w:t>
+        <w:t xml:space="preserve">  ubuntu:24.04 bash</w:t>
       </w:r>
     </w:p>
     <w:p>
@@ -1994,10 +1940,7 @@
     </w:p>
     <w:p>
       <w:r>
-        <w:t>Expect</w:t>
-      </w:r>
-      <w:r>
-        <w:t>ed result: amd64</w:t>
+        <w:t>Expected result: amd64</w:t>
       </w:r>
     </w:p>
     <w:p>
@@ -2068,13 +2011,7 @@
         <w:rPr>
           <w:color w:val="0B2545"/>
         </w:rPr>
-        <w:t>These packages are installed only in the temporary container so it can download and index the of</w:t>
-      </w:r>
-      <w:r>
-        <w:rPr>
-          <w:color w:val="0B2545"/>
-        </w:rPr>
-        <w:t>fline bundle.</w:t>
+        <w:t>These packages are installed only in the temporary container so it can download and index the offline bundle.</w:t>
       </w:r>
     </w:p>
     <w:p>
@@ -2127,8 +2064,6 @@
       </w:r>
       <w:r>
         <w:br/>
-      </w:r>
-      <w:r>
         <w:t xml:space="preserve">  -o /etc/apt/keyrings/docker.asc</w:t>
       </w:r>
     </w:p>
@@ -2142,10 +2077,7 @@
         <w:shd w:val="clear" w:color="auto" w:fill="F2F4F7"/>
       </w:pPr>
       <w:r>
-        <w:t xml:space="preserve">chmod a+r </w:t>
-      </w:r>
-      <w:r>
-        <w:t>/etc/apt/keyrings/docker.asc</w:t>
+        <w:t>chmod a+r /etc/apt/keyrings/docker.asc</w:t>
       </w:r>
     </w:p>
     <w:p>
@@ -2180,35 +2112,22 @@
       </w:r>
       <w:r>
         <w:br/>
-      </w:r>
-      <w:r>
-        <w:t xml:space="preserve">URIs: </w:t>
-      </w:r>
-      <w:r>
-        <w:t>https://download.docker.com/linux/ubuntu</w:t>
+        <w:t>URIs: https://download.docker.com/linux/ubuntu</w:t>
       </w:r>
       <w:r>
         <w:br/>
-      </w:r>
-      <w:r>
         <w:t>Suites: noble</w:t>
       </w:r>
       <w:r>
         <w:br/>
-      </w:r>
-      <w:r>
         <w:t>Components: stable</w:t>
       </w:r>
       <w:r>
         <w:br/>
-      </w:r>
-      <w:r>
         <w:t>Architectures: amd64</w:t>
       </w:r>
       <w:r>
         <w:br/>
-      </w:r>
-      <w:r>
         <w:t>Signed-By: /etc/apt/keyrings/docker.asc</w:t>
       </w:r>
     </w:p>
@@ -2270,10 +2189,7 @@
         <w:shd w:val="clear" w:color="auto" w:fill="F2F4F7"/>
       </w:pPr>
       <w:r>
-        <w:t>apt-ca</w:t>
-      </w:r>
-      <w:r>
-        <w:t>che madison docker-ce-cli | grep 27.4.0</w:t>
+        <w:t>apt-cache madison docker-ce-cli | grep 27.4.0</w:t>
       </w:r>
     </w:p>
     <w:p>
@@ -2330,17 +2246,12 @@
       </w:r>
       <w:r>
         <w:br/>
-      </w:r>
-      <w:r>
         <w:t>ls -l /packages/MOUNT_TEST</w:t>
       </w:r>
     </w:p>
     <w:p>
       <w:r>
-        <w:t>Use /packages inside the container. The</w:t>
-      </w:r>
-      <w:r>
-        <w:t xml:space="preserve"> Mac path $HOME/Downloads/nkp-offline/docker-debs is not directly addressable inside the container.</w:t>
+        <w:t>Use /packages inside the container. The Mac path $HOME/Downloads/nkp-offline/docker-debs is not directly addressable inside the container.</w:t>
       </w:r>
     </w:p>
     <w:p>
@@ -2388,54 +2299,34 @@
         <w:shd w:val="clear" w:color="auto" w:fill="F2F4F7"/>
       </w:pPr>
       <w:r>
-        <w:t>apt-get -o Dir::Cache::archives=/packages --download-only --reinstall inst</w:t>
-      </w:r>
-      <w:r>
-        <w:t>all \</w:t>
+        <w:t>apt-get -o Dir::Cache::archives=/packages --download-only --reinstall install \</w:t>
       </w:r>
       <w:r>
         <w:br/>
-      </w:r>
-      <w:r>
         <w:t>docker-ce='5:27.4.0-1~ubuntu.24.04~noble' \</w:t>
       </w:r>
       <w:r>
         <w:br/>
-      </w:r>
-      <w:r>
         <w:t>docker-ce-cli='5:27.4.0-1~ubuntu.24.04~noble' \</w:t>
       </w:r>
       <w:r>
         <w:br/>
-      </w:r>
-      <w:r>
         <w:t>containerd.io='1.7.24-1' \</w:t>
       </w:r>
       <w:r>
         <w:br/>
-      </w:r>
-      <w:r>
         <w:t>docker-buildx-plugin='0.19.2-1~ubuntu.24.04~noble' \</w:t>
       </w:r>
       <w:r>
         <w:br/>
-      </w:r>
-      <w:r>
         <w:t>docker-compose-plugin='2.31.0-1~ubuntu.24.04~noble' \</w:t>
       </w:r>
       <w:r>
         <w:br/>
-      </w:r>
-      <w:r>
-        <w:t>docker-ce-rootless-extra</w:t>
-      </w:r>
-      <w:r>
-        <w:t>s='5:27.4.0-1~ubuntu.24.04~noble' \</w:t>
+        <w:t>docker-ce-rootless-extras='5:27.4.0-1~ubuntu.24.04~noble' \</w:t>
       </w:r>
       <w:r>
         <w:br/>
-      </w:r>
-      <w:r>
         <w:t>ca-certificates curl openssl nano jq unzip</w:t>
       </w:r>
     </w:p>
@@ -2482,10 +2373,7 @@
     </w:p>
     <w:p>
       <w:r>
-        <w:t xml:space="preserve">Validated bundle result: 93 .deb packages. A future rebuild may resolve a </w:t>
-      </w:r>
-      <w:r>
-        <w:t>different number because Ubuntu security dependencies change; review all differences.</w:t>
+        <w:t>Validated bundle result: 93 .deb packages. A future rebuild may resolve a different number because Ubuntu security dependencies change; review all differences.</w:t>
       </w:r>
     </w:p>
     <w:p>
@@ -2534,13 +2422,7 @@
         <w:rPr>
           <w:color w:val="0B2545"/>
         </w:rPr>
-        <w:t xml:space="preserve">Docker </w:t>
-      </w:r>
-      <w:r>
-        <w:rPr>
-          <w:color w:val="0B2545"/>
-        </w:rPr>
-        <w:t>Engine 27.4.0 and containerd.io 1.7.24-1, both AMD64.</w:t>
+        <w:t>Docker Engine 27.4.0 and containerd.io 1.7.24-1, both AMD64.</w:t>
       </w:r>
     </w:p>
     <w:p>
@@ -2593,10 +2475,7 @@
     </w:p>
     <w:p>
       <w:r>
-        <w:t xml:space="preserve">The warning 'Packages in archive but missing from override file' is expected </w:t>
-      </w:r>
-      <w:r>
-        <w:t>because no Debian override metadata is supplied. The validated output wrote 93 entries.</w:t>
+        <w:t>The warning 'Packages in archive but missing from override file' is expected because no Debian override metadata is supplied. The validated output wrote 93 entries.</w:t>
       </w:r>
     </w:p>
     <w:p>
@@ -2639,12 +2518,7 @@
       </w:r>
       <w:r>
         <w:br/>
-      </w:r>
-      <w:r>
-        <w:t>grep -A 2 '^Package: containerd.io$'</w:t>
-      </w:r>
-      <w:r>
-        <w:t xml:space="preserve"> /packages/Packages</w:t>
+        <w:t>grep -A 2 '^Package: containerd.io$' /packages/Packages</w:t>
       </w:r>
     </w:p>
     <w:p>
@@ -2716,13 +2590,7 @@
         <w:rPr>
           <w:color w:val="0B2545"/>
         </w:rPr>
-        <w:t xml:space="preserve">This runbook records kubectl v1.32.7. Confirm the selected NKP Kubernetes API server is within one minor version. </w:t>
-      </w:r>
-      <w:r>
-        <w:rPr>
-          <w:color w:val="0B2545"/>
-        </w:rPr>
-        <w:t>Do not use a floating 'latest' URL for a dark-site deployment.</w:t>
+        <w:t>This runbook records kubectl v1.32.7. Confirm the selected NKP Kubernetes API server is within one minor version. Do not use a floating 'latest' URL for a dark-site deployment.</w:t>
       </w:r>
     </w:p>
     <w:p>
@@ -2792,10 +2660,7 @@
         <w:shd w:val="clear" w:color="auto" w:fill="F2F4F7"/>
       </w:pPr>
       <w:r>
-        <w:t>curl -LO https://dl.k8s.io/release/v1.32.7/</w:t>
-      </w:r>
-      <w:r>
-        <w:t>bin/linux/amd64/kubectl</w:t>
+        <w:t>curl -LO https://dl.k8s.io/release/v1.32.7/bin/linux/amd64/kubectl</w:t>
       </w:r>
     </w:p>
     <w:p>
@@ -2922,10 +2787,7 @@
         <w:shd w:val="clear" w:color="auto" w:fill="F2F4F7"/>
       </w:pPr>
       <w:r>
-        <w:t xml:space="preserve">cd </w:t>
-      </w:r>
-      <w:r>
-        <w:t>"$HOME/Downloads/nkp-offline"</w:t>
+        <w:t>cd "$HOME/Downloads/nkp-offline"</w:t>
       </w:r>
     </w:p>
     <w:p>
@@ -2942,38 +2804,26 @@
       </w:r>
       <w:r>
         <w:br/>
-      </w:r>
-      <w:r>
         <w:t>docker-debs/*.deb \</w:t>
       </w:r>
       <w:r>
         <w:br/>
-      </w:r>
-      <w:r>
         <w:t>docker-debs/Packages \</w:t>
       </w:r>
       <w:r>
         <w:br/>
-      </w:r>
-      <w:r>
         <w:t>docker-debs/Packages.gz \</w:t>
       </w:r>
       <w:r>
         <w:br/>
-      </w:r>
-      <w:r>
         <w:t>kubectl/kubectl \</w:t>
       </w:r>
       <w:r>
         <w:br/>
-      </w:r>
-      <w:r>
         <w:t>kubectl/kubectl.sha256 \</w:t>
       </w:r>
       <w:r>
         <w:br/>
-      </w:r>
-      <w:r>
         <w:t>&gt; SHA256SUMS</w:t>
       </w:r>
     </w:p>
@@ -2992,10 +2842,7 @@
     </w:p>
     <w:p>
       <w:r>
-        <w:t xml:space="preserve">Validated result: 97 entries - 93 DEB packages, two </w:t>
-      </w:r>
-      <w:r>
-        <w:t>repository indexes, kubectl, and the kubectl vendor checksum.</w:t>
+        <w:t>Validated result: 97 entries - 93 DEB packages, two repository indexes, kubectl, and the kubectl vendor checksum.</w:t>
       </w:r>
     </w:p>
     <w:p>
@@ -3079,21 +2926,14 @@
       </w:pPr>
       <w:r>
         <w:lastRenderedPageBreak/>
-        <w:t xml:space="preserve">COPYFILE_DISABLE=1 tar </w:t>
-      </w:r>
-      <w:r>
-        <w:t>-czf \</w:t>
+        <w:t>COPYFILE_DISABLE=1 tar -czf \</w:t>
       </w:r>
       <w:r>
         <w:br/>
-      </w:r>
-      <w:r>
         <w:t>nkp-bastion-prerequisites-ubuntu24.04-amd64.tar.gz \</w:t>
       </w:r>
       <w:r>
         <w:br/>
-      </w:r>
-      <w:r>
         <w:t>nkp-offline</w:t>
       </w:r>
     </w:p>
@@ -3139,15 +2979,7 @@
           <w:color w:val="1F4D78"/>
           <w:sz w:val="24"/>
         </w:rPr>
-        <w:t>Step D4 - Record the transfer ch</w:t>
-      </w:r>
-      <w:r>
-        <w:rPr>
-          <w:b/>
-          <w:color w:val="1F4D78"/>
-          <w:sz w:val="24"/>
-        </w:rPr>
-        <w:t>ecksum</w:t>
+        <w:t>Step D4 - Record the transfer checksum</w:t>
       </w:r>
       <w:r>
         <w:rPr>
@@ -3214,13 +3046,7 @@
         <w:rPr>
           <w:color w:val="0B2545"/>
         </w:rPr>
-        <w:t xml:space="preserve">This value applies only to the validated archive created during this </w:t>
-      </w:r>
-      <w:r>
-        <w:rPr>
-          <w:color w:val="0B2545"/>
-        </w:rPr>
-        <w:t>working session. Rebuilding or modifying the archive changes the checksum; calculate and record a new value.</w:t>
+        <w:t>This value applies only to the validated archive created during this working session. Rebuilding or modifying the archive changes the checksum; calculate and record a new value.</w:t>
       </w:r>
     </w:p>
     <w:p>
@@ -3252,10 +3078,7 @@
         <w:spacing w:after="80"/>
       </w:pPr>
       <w:r>
-        <w:t xml:space="preserve">Record the archive name, </w:t>
-      </w:r>
-      <w:r>
-        <w:t>size, SHA-256 value, download date, owner, and source URLs.</w:t>
+        <w:t>Record the archive name, size, SHA-256 value, download date, owner, and source URLs.</w:t>
       </w:r>
     </w:p>
     <w:p>
@@ -3291,10 +3114,7 @@
         <w:spacing w:after="80"/>
       </w:pPr>
       <w:r>
-        <w:t>Deliver the recorded checksum to the d</w:t>
-      </w:r>
-      <w:r>
-        <w:t>ark-site operator through an approved channel independent of the archive where possible.</w:t>
+        <w:t>Deliver the recorded checksum to the dark-site operator through an approved channel independent of the archive where possible.</w:t>
       </w:r>
     </w:p>
     <w:p>
@@ -3350,14 +3170,10 @@
       </w:r>
       <w:r>
         <w:br/>
-      </w:r>
-      <w:r>
         <w:t>dpkg --print-architecture</w:t>
       </w:r>
       <w:r>
         <w:br/>
-      </w:r>
-      <w:r>
         <w:t>uname -m</w:t>
       </w:r>
     </w:p>
@@ -3421,13 +3237,7 @@
         <w:rPr>
           <w:color w:val="0B2545"/>
         </w:rPr>
-        <w:t xml:space="preserve">The SHA-256 value must exactly match </w:t>
-      </w:r>
-      <w:r>
-        <w:rPr>
-          <w:color w:val="0B2545"/>
-        </w:rPr>
-        <w:t>e693414b0a5224b08a2ead216dee2465a7c265f0ff8b98035f89ad21ff3a54fc. Stop if it differs.</w:t>
+        <w:t>The SHA-256 value must exactly match e693414b0a5224b08a2ead216dee2465a7c265f0ff8b98035f89ad21ff3a54fc. Stop if it differs.</w:t>
       </w:r>
     </w:p>
     <w:p>
@@ -3479,12 +3289,7 @@
       </w:r>
       <w:r>
         <w:br/>
-      </w:r>
-      <w:r>
-        <w:t xml:space="preserve">sudo chmod -R </w:t>
-      </w:r>
-      <w:r>
-        <w:t>a+rX /opt/nkp-offline</w:t>
+        <w:t>sudo chmod -R a+rX /opt/nkp-offline</w:t>
       </w:r>
     </w:p>
     <w:p>
@@ -3523,8 +3328,6 @@
       </w:r>
       <w:r>
         <w:br/>
-      </w:r>
-      <w:r>
         <w:t>sha256sum -c SHA256SUMS</w:t>
       </w:r>
     </w:p>
@@ -3538,10 +3341,7 @@
         <w:pStyle w:val="Heading1"/>
       </w:pPr>
       <w:r>
-        <w:t>10. Phase G - Install Docker and</w:t>
-      </w:r>
-      <w:r>
-        <w:t xml:space="preserve"> utilities offline</w:t>
+        <w:t>10. Phase G - Install Docker and utilities offline</w:t>
       </w:r>
     </w:p>
     <w:p>
@@ -3580,8 +3380,6 @@
       </w:r>
       <w:r>
         <w:br/>
-      </w:r>
-      <w:r>
         <w:t>docker-buildx podman-docker containerd runc 2&gt;/dev/null</w:t>
       </w:r>
     </w:p>
@@ -3605,13 +3403,7 @@
         <w:rPr>
           <w:color w:val="0B2545"/>
         </w:rPr>
-        <w:t>If conflicting packages are displ</w:t>
-      </w:r>
-      <w:r>
-        <w:rPr>
-          <w:color w:val="0B2545"/>
-        </w:rPr>
-        <w:t>ayed, review their ownership and impact. Do not blindly remove an existing runtime from a shared Bastion.</w:t>
+        <w:t>If conflicting packages are displayed, review their ownership and impact. Do not blindly remove an existing runtime from a shared Bastion.</w:t>
       </w:r>
     </w:p>
     <w:p>
@@ -3650,12 +3442,7 @@
       </w:r>
       <w:r>
         <w:br/>
-      </w:r>
-      <w:r>
-        <w:t>sudo tee /e</w:t>
-      </w:r>
-      <w:r>
-        <w:t>tc/apt/sources.list.d/nkp-offline.list</w:t>
+        <w:t>sudo tee /etc/apt/sources.list.d/nkp-offline.list</w:t>
       </w:r>
     </w:p>
     <w:p>
@@ -3700,26 +3487,18 @@
       </w:r>
       <w:r>
         <w:br/>
-      </w:r>
-      <w:r>
         <w:t>-o Dir::Etc::sourcelist=/etc/apt/sources.list.d/nkp-offline.list \</w:t>
       </w:r>
       <w:r>
         <w:br/>
-      </w:r>
-      <w:r>
         <w:t>-o Dir::Etc::sourceparts=- \</w:t>
       </w:r>
       <w:r>
         <w:br/>
-      </w:r>
-      <w:r>
         <w:t>-o APT::Get::List-Cleanup=0 \</w:t>
       </w:r>
       <w:r>
         <w:br/>
-      </w:r>
-      <w:r>
         <w:t>update</w:t>
       </w:r>
     </w:p>
@@ -3760,10 +3539,7 @@
     </w:p>
     <w:p>
       <w:r>
-        <w:t>Confi</w:t>
-      </w:r>
-      <w:r>
-        <w:t>rm Docker 27.4.0 and containerd.io 1.7.24-1 appear before installation.</w:t>
+        <w:t>Confirm Docker 27.4.0 and containerd.io 1.7.24-1 appear before installation.</w:t>
       </w:r>
     </w:p>
     <w:p>
@@ -3802,68 +3578,42 @@
       </w:r>
       <w:r>
         <w:br/>
-      </w:r>
-      <w:r>
-        <w:t xml:space="preserve">-o </w:t>
-      </w:r>
-      <w:r>
-        <w:t>Dir::Etc::sourcelist=/etc/apt/sources.list.d/nkp-offline.list \</w:t>
+        <w:t>-o Dir::Etc::sourcelist=/etc/apt/sources.list.d/nkp-offline.list \</w:t>
       </w:r>
       <w:r>
         <w:br/>
-      </w:r>
-      <w:r>
         <w:t>-o Dir::Etc::sourceparts=- \</w:t>
       </w:r>
       <w:r>
         <w:br/>
-      </w:r>
-      <w:r>
         <w:t>install \</w:t>
       </w:r>
       <w:r>
         <w:br/>
-      </w:r>
-      <w:r>
         <w:t>docker-ce='5:27.4.0-1~ubuntu.24.04~noble' \</w:t>
       </w:r>
       <w:r>
         <w:br/>
-      </w:r>
-      <w:r>
         <w:t>docker-ce-cli='5:27.4.0-1~ubuntu.24.04~noble' \</w:t>
       </w:r>
       <w:r>
         <w:br/>
-      </w:r>
-      <w:r>
         <w:t>containerd.io='1.7.24-1' \</w:t>
       </w:r>
       <w:r>
         <w:br/>
-      </w:r>
-      <w:r>
-        <w:t>docker-buildx-plugin='0.19.2-1~ubu</w:t>
-      </w:r>
-      <w:r>
-        <w:t>ntu.24.04~noble' \</w:t>
+        <w:t>docker-buildx-plugin='0.19.2-1~ubuntu.24.04~noble' \</w:t>
       </w:r>
       <w:r>
         <w:br/>
-      </w:r>
-      <w:r>
         <w:t>docker-compose-plugin='2.31.0-1~ubuntu.24.04~noble' \</w:t>
       </w:r>
       <w:r>
         <w:br/>
-      </w:r>
-      <w:r>
         <w:t>docker-ce-rootless-extras='5:27.4.0-1~ubuntu.24.04~noble' \</w:t>
       </w:r>
       <w:r>
         <w:br/>
-      </w:r>
-      <w:r>
         <w:t>nano jq unzip ca-certificates curl openssl</w:t>
       </w:r>
     </w:p>
@@ -3899,10 +3649,7 @@
         <w:shd w:val="clear" w:color="auto" w:fill="F2F4F7"/>
       </w:pPr>
       <w:r>
-        <w:t>sudo systemctl enable --now dock</w:t>
-      </w:r>
-      <w:r>
-        <w:t>er</w:t>
+        <w:t>sudo systemctl enable --now docker</w:t>
       </w:r>
     </w:p>
     <w:p>
@@ -3919,8 +3666,6 @@
       </w:r>
       <w:r>
         <w:br/>
-      </w:r>
-      <w:r>
         <w:t>sudo systemctl is-active docker</w:t>
       </w:r>
     </w:p>
@@ -3938,8 +3683,6 @@
       </w:r>
       <w:r>
         <w:br/>
-      </w:r>
-      <w:r>
         <w:t>sudo docker info</w:t>
       </w:r>
     </w:p>
@@ -3957,14 +3700,10 @@
       </w:r>
       <w:r>
         <w:br/>
-      </w:r>
-      <w:r>
         <w:t>docker buildx version</w:t>
       </w:r>
       <w:r>
         <w:br/>
-      </w:r>
-      <w:r>
         <w:t>docker compose version</w:t>
       </w:r>
     </w:p>
@@ -3988,13 +3727,7 @@
         <w:rPr>
           <w:color w:val="0B2545"/>
         </w:rPr>
-        <w:t xml:space="preserve">Docker Server 27.4.0, Buildx </w:t>
-      </w:r>
-      <w:r>
-        <w:rPr>
-          <w:color w:val="0B2545"/>
-        </w:rPr>
-        <w:t>0.19.2, Compose 2.31.0, and an active Docker service.</w:t>
+        <w:t>Docker Server 27.4.0, Buildx 0.19.2, Compose 2.31.0, and an active Docker service.</w:t>
       </w:r>
     </w:p>
     <w:p>
@@ -4031,15 +3764,7 @@
           <w:color w:val="1F4D78"/>
           <w:sz w:val="24"/>
         </w:rPr>
-        <w:t>Step G7 - Permit the NKP deplo</w:t>
-      </w:r>
-      <w:r>
-        <w:rPr>
-          <w:b/>
-          <w:color w:val="1F4D78"/>
-          <w:sz w:val="24"/>
-        </w:rPr>
-        <w:t>yment account to use Docker</w:t>
+        <w:t>Step G7 - Permit the NKP deployment account to use Docker</w:t>
       </w:r>
       <w:r>
         <w:rPr>
@@ -4074,10 +3799,7 @@
       </w:pPr>
       <w:r>
         <w:lastRenderedPageBreak/>
-        <w:t xml:space="preserve">11. Phase H - Install </w:t>
-      </w:r>
-      <w:r>
-        <w:t>kubectl offline</w:t>
+        <w:t>11. Phase H - Install kubectl offline</w:t>
       </w:r>
     </w:p>
     <w:p>
@@ -4116,8 +3838,6 @@
       </w:r>
       <w:r>
         <w:br/>
-      </w:r>
-      <w:r>
         <w:t>echo "$(cat kubectl.sha256)  kubectl" | sha256sum -c -</w:t>
       </w:r>
     </w:p>
@@ -4158,10 +3878,7 @@
         <w:shd w:val="clear" w:color="auto" w:fill="F2F4F7"/>
       </w:pPr>
       <w:r>
-        <w:t>sudo insta</w:t>
-      </w:r>
-      <w:r>
-        <w:t>ll -o root -g root -m 0755 kubectl /usr/local/bin/kubectl</w:t>
+        <w:t>sudo install -o root -g root -m 0755 kubectl /usr/local/bin/kubectl</w:t>
       </w:r>
     </w:p>
     <w:p>
@@ -4200,8 +3917,6 @@
       </w:r>
       <w:r>
         <w:br/>
-      </w:r>
-      <w:r>
         <w:t>kubectl version --client --output=yaml</w:t>
       </w:r>
     </w:p>
@@ -4212,10 +3927,7 @@
     </w:p>
     <w:p>
       <w:r>
-        <w:t xml:space="preserve">A normal kubectl get </w:t>
-      </w:r>
-      <w:r>
-        <w:t>nodes command is not expected to work until NKP creates the cluster and a valid kubeconfig is available.</w:t>
+        <w:t>A normal kubectl get nodes command is not expected to work until NKP creates the cluster and a valid kubeconfig is available.</w:t>
       </w:r>
     </w:p>
     <w:p>
@@ -4424,14 +4136,7 @@
                 <w:color w:val="0B2545"/>
                 <w:sz w:val="19"/>
               </w:rPr>
-              <w:t xml:space="preserve">Artifact </w:t>
-            </w:r>
-            <w:r>
-              <w:rPr>
-                <w:color w:val="0B2545"/>
-                <w:sz w:val="19"/>
-              </w:rPr>
-              <w:t>integrity</w:t>
+              <w:t>Artifact integrity</w:t>
             </w:r>
           </w:p>
         </w:tc>
@@ -4816,14 +4521,7 @@
                 <w:color w:val="0B2545"/>
                 <w:sz w:val="19"/>
               </w:rPr>
-              <w:t xml:space="preserve">Buildx / </w:t>
-            </w:r>
-            <w:r>
-              <w:rPr>
-                <w:color w:val="0B2545"/>
-                <w:sz w:val="19"/>
-              </w:rPr>
-              <w:t>Compose</w:t>
+              <w:t>Buildx / Compose</w:t>
             </w:r>
           </w:p>
         </w:tc>
@@ -5122,10 +4820,7 @@
         <w:pStyle w:val="Heading2"/>
       </w:pPr>
       <w:r>
-        <w:t xml:space="preserve">APT reports a </w:t>
-      </w:r>
-      <w:r>
-        <w:t>missing dependency</w:t>
+        <w:t>APT reports a missing dependency</w:t>
       </w:r>
     </w:p>
     <w:p>
@@ -5148,10 +4843,7 @@
     </w:p>
     <w:p>
       <w:r>
-        <w:t xml:space="preserve">Return to the connected Mac </w:t>
-      </w:r>
-      <w:r>
-        <w:t>workflow, download the missing Ubuntu 24.04 AMD64 package into docker-debs, regenerate Packages and Packages.gz, rebuild SHA256SUMS, recreate the tar, and record its new transfer checksum.</w:t>
+        <w:t>Return to the connected Mac workflow, download the missing Ubuntu 24.04 AMD64 package into docker-debs, regenerate Packages and Packages.gz, rebuild SHA256SUMS, recreate the tar, and record its new transfer checksum.</w:t>
       </w:r>
     </w:p>
     <w:p>
@@ -5176,26 +4868,16 @@
       </w:r>
       <w:r>
         <w:br/>
-      </w:r>
-      <w:r>
-        <w:t xml:space="preserve">sudo </w:t>
-      </w:r>
-      <w:r>
-        <w:t>journalctl -u docker -n 100 --no-pager</w:t>
+        <w:t>sudo journalctl -u docker -n 100 --no-pager</w:t>
       </w:r>
       <w:r>
         <w:br/>
-      </w:r>
-      <w:r>
         <w:t>sudo systemctl status containerd --no-pager</w:t>
       </w:r>
     </w:p>
     <w:p>
       <w:r>
-        <w:t xml:space="preserve">Check for a pre-existing daemon configuration, storage-driver issue, conflicting runtime package, filesystem capacity problem, or service dependency failure before changing </w:t>
-      </w:r>
-      <w:r>
-        <w:t>configuration.</w:t>
+        <w:t>Check for a pre-existing daemon configuration, storage-driver issue, conflicting runtime package, filesystem capacity problem, or service dependency failure before changing configuration.</w:t>
       </w:r>
     </w:p>
     <w:p>
@@ -5241,10 +4923,7 @@
         <w:spacing w:after="80"/>
       </w:pPr>
       <w:r>
-        <w:t>Nutanix entitlement and co</w:t>
-      </w:r>
-      <w:r>
-        <w:t>mpatibility evidence for the exact NKP patch and Kubernetes version.</w:t>
+        <w:t>Nutanix entitlement and compatibility evidence for the exact NKP patch and Kubernetes version.</w:t>
       </w:r>
     </w:p>
     <w:p>
@@ -5280,10 +4959,7 @@
         <w:spacing w:after="80"/>
       </w:pPr>
       <w:r>
-        <w:t>Transfer-media identifier, malware-scan evidence, approver, and c</w:t>
-      </w:r>
-      <w:r>
-        <w:t>ustody timestamps.</w:t>
+        <w:t>Transfer-media identifier, malware-scan evidence, approver, and custody timestamps.</w:t>
       </w:r>
     </w:p>
     <w:p>
@@ -5422,6 +5098,9 @@
         <w:shd w:val="clear" w:color="auto" w:fill="FFF4CE"/>
         <w:spacing w:before="60" w:after="160" w:line="276" w:lineRule="auto"/>
         <w:ind w:left="144" w:right="144"/>
+        <w:rPr>
+          <w:color w:val="0B2545"/>
+        </w:rPr>
       </w:pPr>
       <w:r>
         <w:rPr>
@@ -5436,6 +5115,729 @@
         </w:rPr>
         <w:t>If any binary, package, repository index, or archive is changed, regenerate all affected checksums and update this runbook before customer execution.</w:t>
       </w:r>
+    </w:p>
+    <w:p>
+      <w:pPr>
+        <w:pStyle w:val="NormalWeb"/>
+      </w:pPr>
+      <w:r>
+        <w:rPr>
+          <w:color w:val="0B2545"/>
+        </w:rPr>
+        <w:br w:type="page"/>
+      </w:r>
+      <w:r>
+        <w:lastRenderedPageBreak/>
+        <w:t>The offline bundle was created successfully.</w:t>
+      </w:r>
+    </w:p>
+    <w:p>
+      <w:pPr>
+        <w:numPr>
+          <w:ilvl w:val="0"/>
+          <w:numId w:val="2"/>
+        </w:numPr>
+        <w:spacing w:before="100" w:beforeAutospacing="1" w:after="100" w:afterAutospacing="1" w:line="240" w:lineRule="auto"/>
+      </w:pPr>
+      <w:r>
+        <w:t xml:space="preserve">Archive size: </w:t>
+      </w:r>
+      <w:r>
+        <w:rPr>
+          <w:rStyle w:val="HTMLCode"/>
+          <w:rFonts w:eastAsiaTheme="minorEastAsia"/>
+        </w:rPr>
+        <w:t>173 MB</w:t>
+      </w:r>
+    </w:p>
+    <w:p>
+      <w:pPr>
+        <w:numPr>
+          <w:ilvl w:val="0"/>
+          <w:numId w:val="2"/>
+        </w:numPr>
+        <w:spacing w:before="100" w:beforeAutospacing="1" w:after="100" w:afterAutospacing="1" w:line="240" w:lineRule="auto"/>
+      </w:pPr>
+      <w:r>
+        <w:t xml:space="preserve">Internal files: </w:t>
+      </w:r>
+      <w:r>
+        <w:rPr>
+          <w:rStyle w:val="HTMLCode"/>
+          <w:rFonts w:eastAsiaTheme="minorEastAsia"/>
+        </w:rPr>
+        <w:t>97</w:t>
+      </w:r>
+    </w:p>
+    <w:p>
+      <w:pPr>
+        <w:numPr>
+          <w:ilvl w:val="0"/>
+          <w:numId w:val="2"/>
+        </w:numPr>
+        <w:spacing w:before="100" w:beforeAutospacing="1" w:after="100" w:afterAutospacing="1" w:line="240" w:lineRule="auto"/>
+      </w:pPr>
+      <w:r>
+        <w:t>Target: Ubuntu 24.04 AMD64</w:t>
+      </w:r>
+    </w:p>
+    <w:p>
+      <w:pPr>
+        <w:numPr>
+          <w:ilvl w:val="0"/>
+          <w:numId w:val="2"/>
+        </w:numPr>
+        <w:spacing w:before="100" w:beforeAutospacing="1" w:after="100" w:afterAutospacing="1" w:line="240" w:lineRule="auto"/>
+      </w:pPr>
+      <w:r>
+        <w:t>SHA-256:</w:t>
+      </w:r>
+    </w:p>
+    <w:p>
+      <w:pPr>
+        <w:pStyle w:val="HTMLPreformatted"/>
+      </w:pPr>
+      <w:r>
+        <w:rPr>
+          <w:rStyle w:val="HTMLCode"/>
+        </w:rPr>
+        <w:t>e693414b0a5224b08a2ead216dee2465a7c265f0ff8b98035f89ad21ff3a54fc</w:t>
+      </w:r>
+    </w:p>
+    <w:p>
+      <w:pPr>
+        <w:pStyle w:val="Heading2"/>
+      </w:pPr>
+      <w:r>
+        <w:t>1. Transfer to the Bastion</w:t>
+      </w:r>
+    </w:p>
+    <w:p>
+      <w:pPr>
+        <w:pStyle w:val="NormalWeb"/>
+      </w:pPr>
+      <w:r>
+        <w:t>Transfer this file using the customer-approved media/process:</w:t>
+      </w:r>
+    </w:p>
+    <w:p>
+      <w:pPr>
+        <w:pStyle w:val="HTMLPreformatted"/>
+      </w:pPr>
+      <w:r>
+        <w:rPr>
+          <w:rStyle w:val="HTMLCode"/>
+        </w:rPr>
+        <w:t>nkp-bastion-prerequisites-ubuntu24.04-amd64.tar.gz</w:t>
+      </w:r>
+    </w:p>
+    <w:p>
+      <w:pPr>
+        <w:pStyle w:val="Heading2"/>
+      </w:pPr>
+      <w:r>
+        <w:t>2. Verify it on Ubuntu</w:t>
+      </w:r>
+    </w:p>
+    <w:p>
+      <w:pPr>
+        <w:pStyle w:val="NormalWeb"/>
+      </w:pPr>
+      <w:r>
+        <w:t>On the Bastion:</w:t>
+      </w:r>
+    </w:p>
+    <w:p>
+      <w:pPr>
+        <w:pStyle w:val="HTMLPreformatted"/>
+      </w:pPr>
+      <w:r>
+        <w:rPr>
+          <w:rStyle w:val="HTMLCode"/>
+        </w:rPr>
+        <w:t>sha256sum nkp-bastion-prerequisites-ubuntu24.04-amd64.tar.gz</w:t>
+      </w:r>
+    </w:p>
+    <w:p>
+      <w:pPr>
+        <w:pStyle w:val="NormalWeb"/>
+      </w:pPr>
+      <w:r>
+        <w:t>The checksum must exactly match:</w:t>
+      </w:r>
+    </w:p>
+    <w:p>
+      <w:pPr>
+        <w:pStyle w:val="HTMLPreformatted"/>
+      </w:pPr>
+      <w:r>
+        <w:rPr>
+          <w:rStyle w:val="HTMLCode"/>
+        </w:rPr>
+        <w:t>e693414b0a5224b08a2ead216dee2465a7c265f0ff8b98035f89ad21ff3a54fc</w:t>
+      </w:r>
+    </w:p>
+    <w:p>
+      <w:pPr>
+        <w:pStyle w:val="NormalWeb"/>
+      </w:pPr>
+      <w:r>
+        <w:t>Stop if it does not match.</w:t>
+      </w:r>
+    </w:p>
+    <w:p>
+      <w:pPr>
+        <w:pStyle w:val="NormalWeb"/>
+      </w:pPr>
+      <w:r>
+        <w:t>Verify the operating system:</w:t>
+      </w:r>
+    </w:p>
+    <w:p>
+      <w:pPr>
+        <w:pStyle w:val="HTMLPreformatted"/>
+      </w:pPr>
+      <w:r>
+        <w:rPr>
+          <w:rStyle w:val="HTMLCode"/>
+        </w:rPr>
+        <w:t>cat /etc/os-release</w:t>
+      </w:r>
+    </w:p>
+    <w:p>
+      <w:pPr>
+        <w:pStyle w:val="HTMLPreformatted"/>
+      </w:pPr>
+      <w:r>
+        <w:rPr>
+          <w:rStyle w:val="HTMLCode"/>
+        </w:rPr>
+        <w:t>dpkg --print-architecture</w:t>
+      </w:r>
+    </w:p>
+    <w:p>
+      <w:pPr>
+        <w:pStyle w:val="NormalWeb"/>
+      </w:pPr>
+      <w:r>
+        <w:t>Expected architecture:</w:t>
+      </w:r>
+    </w:p>
+    <w:p>
+      <w:pPr>
+        <w:pStyle w:val="HTMLPreformatted"/>
+      </w:pPr>
+      <w:r>
+        <w:rPr>
+          <w:rStyle w:val="HTMLCode"/>
+        </w:rPr>
+        <w:t>amd64</w:t>
+      </w:r>
+    </w:p>
+    <w:p>
+      <w:pPr>
+        <w:pStyle w:val="Heading2"/>
+      </w:pPr>
+      <w:r>
+        <w:t>3. Extract the archive</w:t>
+      </w:r>
+    </w:p>
+    <w:p>
+      <w:pPr>
+        <w:pStyle w:val="HTMLPreformatted"/>
+      </w:pPr>
+      <w:r>
+        <w:rPr>
+          <w:rStyle w:val="HTMLCode"/>
+        </w:rPr>
+        <w:t>sudo tar -xzf nkp-bastion-prerequisites-ubuntu24.04-amd64.tar.gz -C /opt</w:t>
+      </w:r>
+    </w:p>
+    <w:p>
+      <w:pPr>
+        <w:pStyle w:val="NormalWeb"/>
+      </w:pPr>
+      <w:r>
+        <w:t>Set permissions:</w:t>
+      </w:r>
+    </w:p>
+    <w:p>
+      <w:pPr>
+        <w:pStyle w:val="HTMLPreformatted"/>
+      </w:pPr>
+      <w:r>
+        <w:rPr>
+          <w:rStyle w:val="HTMLCode"/>
+        </w:rPr>
+        <w:t>sudo chown -R root:root /opt/nkp-offline</w:t>
+      </w:r>
+    </w:p>
+    <w:p>
+      <w:pPr>
+        <w:pStyle w:val="HTMLPreformatted"/>
+      </w:pPr>
+      <w:r>
+        <w:rPr>
+          <w:rStyle w:val="HTMLCode"/>
+        </w:rPr>
+        <w:t>sudo chmod -R a+rX /opt/nkp-offline</w:t>
+      </w:r>
+    </w:p>
+    <w:p>
+      <w:pPr>
+        <w:pStyle w:val="NormalWeb"/>
+      </w:pPr>
+      <w:r>
+        <w:t>Verify all 97 internal files:</w:t>
+      </w:r>
+    </w:p>
+    <w:p>
+      <w:pPr>
+        <w:pStyle w:val="HTMLPreformatted"/>
+      </w:pPr>
+      <w:r>
+        <w:rPr>
+          <w:rStyle w:val="HTMLCode"/>
+        </w:rPr>
+        <w:lastRenderedPageBreak/>
+        <w:t>cd /opt/nkp-offline</w:t>
+      </w:r>
+    </w:p>
+    <w:p>
+      <w:pPr>
+        <w:pStyle w:val="HTMLPreformatted"/>
+      </w:pPr>
+      <w:r>
+        <w:rPr>
+          <w:rStyle w:val="HTMLCode"/>
+        </w:rPr>
+        <w:t>sha256sum -c SHA256SUMS</w:t>
+      </w:r>
+    </w:p>
+    <w:p>
+      <w:pPr>
+        <w:pStyle w:val="NormalWeb"/>
+      </w:pPr>
+      <w:r>
+        <w:t xml:space="preserve">Every entry must report </w:t>
+      </w:r>
+      <w:r>
+        <w:rPr>
+          <w:rStyle w:val="HTMLCode"/>
+        </w:rPr>
+        <w:t>OK</w:t>
+      </w:r>
+      <w:r>
+        <w:t>.</w:t>
+      </w:r>
+    </w:p>
+    <w:p>
+      <w:pPr>
+        <w:pStyle w:val="Heading2"/>
+      </w:pPr>
+      <w:r>
+        <w:t>4. Configure the offline APT repository</w:t>
+      </w:r>
+    </w:p>
+    <w:p>
+      <w:pPr>
+        <w:pStyle w:val="HTMLPreformatted"/>
+      </w:pPr>
+      <w:r>
+        <w:rPr>
+          <w:rStyle w:val="HTMLCode"/>
+        </w:rPr>
+        <w:t>echo "deb [trusted=yes] file:/opt/nkp-offline/docker-debs ./" | sudo tee /etc/apt/sources.list.d/nkp-offline.list</w:t>
+      </w:r>
+    </w:p>
+    <w:p>
+      <w:pPr>
+        <w:pStyle w:val="NormalWeb"/>
+      </w:pPr>
+      <w:r>
+        <w:t>Update using only the offline repository:</w:t>
+      </w:r>
+    </w:p>
+    <w:p>
+      <w:pPr>
+        <w:pStyle w:val="HTMLPreformatted"/>
+        <w:rPr>
+          <w:rStyle w:val="HTMLCode"/>
+        </w:rPr>
+      </w:pPr>
+      <w:r>
+        <w:rPr>
+          <w:rStyle w:val="HTMLCode"/>
+        </w:rPr>
+        <w:t>sudo apt-get \</w:t>
+      </w:r>
+    </w:p>
+    <w:p>
+      <w:pPr>
+        <w:pStyle w:val="HTMLPreformatted"/>
+        <w:rPr>
+          <w:rStyle w:val="HTMLCode"/>
+        </w:rPr>
+      </w:pPr>
+      <w:r>
+        <w:rPr>
+          <w:rStyle w:val="HTMLCode"/>
+        </w:rPr>
+        <w:t>-o Dir::Etc::sourcelist=/etc/apt/sources.list.d/nkp-offline.list \</w:t>
+      </w:r>
+    </w:p>
+    <w:p>
+      <w:pPr>
+        <w:pStyle w:val="HTMLPreformatted"/>
+        <w:rPr>
+          <w:rStyle w:val="HTMLCode"/>
+        </w:rPr>
+      </w:pPr>
+      <w:r>
+        <w:rPr>
+          <w:rStyle w:val="HTMLCode"/>
+        </w:rPr>
+        <w:t>-o Dir::Etc::sourceparts=- \</w:t>
+      </w:r>
+    </w:p>
+    <w:p>
+      <w:pPr>
+        <w:pStyle w:val="HTMLPreformatted"/>
+        <w:rPr>
+          <w:rStyle w:val="HTMLCode"/>
+        </w:rPr>
+      </w:pPr>
+      <w:r>
+        <w:rPr>
+          <w:rStyle w:val="HTMLCode"/>
+        </w:rPr>
+        <w:t>-o APT::Get::List-Cleanup=0 \</w:t>
+      </w:r>
+    </w:p>
+    <w:p>
+      <w:pPr>
+        <w:pStyle w:val="HTMLPreformatted"/>
+      </w:pPr>
+      <w:r>
+        <w:rPr>
+          <w:rStyle w:val="HTMLCode"/>
+        </w:rPr>
+        <w:t>update</w:t>
+      </w:r>
+    </w:p>
+    <w:p>
+      <w:pPr>
+        <w:pStyle w:val="Heading2"/>
+      </w:pPr>
+      <w:r>
+        <w:t>5. Install Docker and utilities</w:t>
+      </w:r>
+    </w:p>
+    <w:p>
+      <w:pPr>
+        <w:pStyle w:val="HTMLPreformatted"/>
+        <w:rPr>
+          <w:rStyle w:val="HTMLCode"/>
+        </w:rPr>
+      </w:pPr>
+      <w:r>
+        <w:rPr>
+          <w:rStyle w:val="HTMLCode"/>
+        </w:rPr>
+        <w:t>sudo apt-get \</w:t>
+      </w:r>
+    </w:p>
+    <w:p>
+      <w:pPr>
+        <w:pStyle w:val="HTMLPreformatted"/>
+        <w:rPr>
+          <w:rStyle w:val="HTMLCode"/>
+        </w:rPr>
+      </w:pPr>
+      <w:r>
+        <w:rPr>
+          <w:rStyle w:val="HTMLCode"/>
+        </w:rPr>
+        <w:t>-o Dir::Etc::sourcelist=/etc/apt/sources.list.d/nkp-offline.list \</w:t>
+      </w:r>
+    </w:p>
+    <w:p>
+      <w:pPr>
+        <w:pStyle w:val="HTMLPreformatted"/>
+        <w:rPr>
+          <w:rStyle w:val="HTMLCode"/>
+        </w:rPr>
+      </w:pPr>
+      <w:r>
+        <w:rPr>
+          <w:rStyle w:val="HTMLCode"/>
+        </w:rPr>
+        <w:t>-o Dir::Etc::sourceparts=- \</w:t>
+      </w:r>
+    </w:p>
+    <w:p>
+      <w:pPr>
+        <w:pStyle w:val="HTMLPreformatted"/>
+        <w:rPr>
+          <w:rStyle w:val="HTMLCode"/>
+        </w:rPr>
+      </w:pPr>
+      <w:r>
+        <w:rPr>
+          <w:rStyle w:val="HTMLCode"/>
+        </w:rPr>
+        <w:t>install \</w:t>
+      </w:r>
+    </w:p>
+    <w:p>
+      <w:pPr>
+        <w:pStyle w:val="HTMLPreformatted"/>
+        <w:rPr>
+          <w:rStyle w:val="HTMLCode"/>
+        </w:rPr>
+      </w:pPr>
+      <w:r>
+        <w:rPr>
+          <w:rStyle w:val="HTMLCode"/>
+        </w:rPr>
+        <w:t>docker-ce='5:27.4.0-1~ubuntu.24.04~noble' \</w:t>
+      </w:r>
+    </w:p>
+    <w:p>
+      <w:pPr>
+        <w:pStyle w:val="HTMLPreformatted"/>
+        <w:rPr>
+          <w:rStyle w:val="HTMLCode"/>
+        </w:rPr>
+      </w:pPr>
+      <w:r>
+        <w:rPr>
+          <w:rStyle w:val="HTMLCode"/>
+        </w:rPr>
+        <w:t>docker-ce-cli='5:27.4.0-1~ubuntu.24.04~noble' \</w:t>
+      </w:r>
+    </w:p>
+    <w:p>
+      <w:pPr>
+        <w:pStyle w:val="HTMLPreformatted"/>
+        <w:rPr>
+          <w:rStyle w:val="HTMLCode"/>
+        </w:rPr>
+      </w:pPr>
+      <w:r>
+        <w:rPr>
+          <w:rStyle w:val="HTMLCode"/>
+        </w:rPr>
+        <w:t>containerd.io='1.7.24-1' \</w:t>
+      </w:r>
+    </w:p>
+    <w:p>
+      <w:pPr>
+        <w:pStyle w:val="HTMLPreformatted"/>
+        <w:rPr>
+          <w:rStyle w:val="HTMLCode"/>
+        </w:rPr>
+      </w:pPr>
+      <w:r>
+        <w:rPr>
+          <w:rStyle w:val="HTMLCode"/>
+        </w:rPr>
+        <w:t>docker-buildx-plugin='0.19.2-1~ubuntu.24.04~noble' \</w:t>
+      </w:r>
+    </w:p>
+    <w:p>
+      <w:pPr>
+        <w:pStyle w:val="HTMLPreformatted"/>
+        <w:rPr>
+          <w:rStyle w:val="HTMLCode"/>
+        </w:rPr>
+      </w:pPr>
+      <w:r>
+        <w:rPr>
+          <w:rStyle w:val="HTMLCode"/>
+        </w:rPr>
+        <w:t>docker-compose-plugin='2.31.0-1~ubuntu.24.04~noble' \</w:t>
+      </w:r>
+    </w:p>
+    <w:p>
+      <w:pPr>
+        <w:pStyle w:val="HTMLPreformatted"/>
+        <w:rPr>
+          <w:rStyle w:val="HTMLCode"/>
+        </w:rPr>
+      </w:pPr>
+      <w:r>
+        <w:rPr>
+          <w:rStyle w:val="HTMLCode"/>
+        </w:rPr>
+        <w:t>docker-ce-rootless-extras='5:27.4.0-1~ubuntu.24.04~noble' \</w:t>
+      </w:r>
+    </w:p>
+    <w:p>
+      <w:pPr>
+        <w:pStyle w:val="HTMLPreformatted"/>
+      </w:pPr>
+      <w:r>
+        <w:rPr>
+          <w:rStyle w:val="HTMLCode"/>
+        </w:rPr>
+        <w:t>nano jq unzip ca-certificates curl openssl</w:t>
+      </w:r>
+    </w:p>
+    <w:p>
+      <w:pPr>
+        <w:pStyle w:val="NormalWeb"/>
+      </w:pPr>
+      <w:r>
+        <w:t>Enable Docker:</w:t>
+      </w:r>
+    </w:p>
+    <w:p>
+      <w:pPr>
+        <w:pStyle w:val="HTMLPreformatted"/>
+      </w:pPr>
+      <w:r>
+        <w:rPr>
+          <w:rStyle w:val="HTMLCode"/>
+        </w:rPr>
+        <w:t>sudo systemctl enable --now docker</w:t>
+      </w:r>
+    </w:p>
+    <w:p>
+      <w:pPr>
+        <w:pStyle w:val="NormalWeb"/>
+      </w:pPr>
+      <w:r>
+        <w:t>Verify:</w:t>
+      </w:r>
+    </w:p>
+    <w:p>
+      <w:pPr>
+        <w:pStyle w:val="HTMLPreformatted"/>
+      </w:pPr>
+      <w:r>
+        <w:rPr>
+          <w:rStyle w:val="HTMLCode"/>
+        </w:rPr>
+        <w:t>sudo systemctl is-active docker</w:t>
+      </w:r>
+    </w:p>
+    <w:p>
+      <w:pPr>
+        <w:pStyle w:val="HTMLPreformatted"/>
+      </w:pPr>
+      <w:r>
+        <w:rPr>
+          <w:rStyle w:val="HTMLCode"/>
+        </w:rPr>
+        <w:t>sudo docker version</w:t>
+      </w:r>
+    </w:p>
+    <w:p>
+      <w:pPr>
+        <w:pStyle w:val="NormalWeb"/>
+      </w:pPr>
+      <w:r>
+        <w:t xml:space="preserve">The server version must show </w:t>
+      </w:r>
+      <w:r>
+        <w:rPr>
+          <w:rStyle w:val="HTMLCode"/>
+        </w:rPr>
+        <w:t>27.4.0</w:t>
+      </w:r>
+      <w:r>
+        <w:t>.</w:t>
+      </w:r>
+    </w:p>
+    <w:p>
+      <w:pPr>
+        <w:pStyle w:val="Heading2"/>
+      </w:pPr>
+      <w:r>
+        <w:t xml:space="preserve">6. Install </w:t>
+      </w:r>
+      <w:proofErr w:type="spellStart"/>
+      <w:r>
+        <w:t>kubectl</w:t>
+      </w:r>
+      <w:proofErr w:type="spellEnd"/>
+    </w:p>
+    <w:p>
+      <w:pPr>
+        <w:pStyle w:val="HTMLPreformatted"/>
+      </w:pPr>
+      <w:r>
+        <w:rPr>
+          <w:rStyle w:val="HTMLCode"/>
+        </w:rPr>
+        <w:t>sudo install -o root -g root -m 0755 /opt/nkp-offline/kubectl/kubectl /usr/local/bin/kubectl</w:t>
+      </w:r>
+    </w:p>
+    <w:p>
+      <w:pPr>
+        <w:pStyle w:val="NormalWeb"/>
+      </w:pPr>
+      <w:r>
+        <w:t>Verify:</w:t>
+      </w:r>
+    </w:p>
+    <w:p>
+      <w:pPr>
+        <w:pStyle w:val="HTMLPreformatted"/>
+      </w:pPr>
+      <w:r>
+        <w:rPr>
+          <w:rStyle w:val="HTMLCode"/>
+        </w:rPr>
+        <w:t>kubectl version --client --output=yaml</w:t>
+      </w:r>
+    </w:p>
+    <w:p>
+      <w:pPr>
+        <w:pStyle w:val="NormalWeb"/>
+      </w:pPr>
+      <w:r>
+        <w:lastRenderedPageBreak/>
+        <w:t>Expected client version:</w:t>
+      </w:r>
+    </w:p>
+    <w:p>
+      <w:pPr>
+        <w:pStyle w:val="HTMLPreformatted"/>
+      </w:pPr>
+      <w:r>
+        <w:rPr>
+          <w:rStyle w:val="HTMLCode"/>
+        </w:rPr>
+        <w:t>v1.32.7</w:t>
+      </w:r>
+    </w:p>
+    <w:p>
+      <w:pPr>
+        <w:pStyle w:val="NormalWeb"/>
+      </w:pPr>
+      <w:r>
+        <w:t xml:space="preserve">Do not run </w:t>
+      </w:r>
+      <w:r>
+        <w:rPr>
+          <w:rStyle w:val="HTMLCode"/>
+        </w:rPr>
+        <w:t>docker run hello-world</w:t>
+      </w:r>
+      <w:r>
+        <w:t>; it will attempt to access the public Docker registry.</w:t>
+      </w:r>
+    </w:p>
+    <w:p>
+      <w:pPr>
+        <w:spacing w:after="200" w:line="276" w:lineRule="auto"/>
+        <w:rPr>
+          <w:color w:val="0B2545"/>
+          <w:lang w:val="en-AE"/>
+        </w:rPr>
+      </w:pPr>
     </w:p>
     <w:sectPr>
       <w:headerReference w:type="default" r:id="rId13"/>
@@ -5624,15 +6026,7 @@
         <w:color w:val="5B6573"/>
         <w:sz w:val="17"/>
       </w:rPr>
-      <w:t xml:space="preserve">NKP </w:t>
-    </w:r>
-    <w:r>
-      <w:rPr>
-        <w:b/>
-        <w:color w:val="5B6573"/>
-        <w:sz w:val="17"/>
-      </w:rPr>
-      <w:t>AIR-GAPPED BASTION RUNBOOK</w:t>
+      <w:t>NKP AIR-GAPPED BASTION RUNBOOK</w:t>
     </w:r>
   </w:p>
 </w:hdr>
@@ -5806,6 +6200,155 @@
     </w:lvl>
   </w:abstractNum>
   <w:abstractNum w:abstractNumId="9" w15:restartNumberingAfterBreak="0">
+    <w:nsid w:val="527467DA"/>
+    <w:multiLevelType w:val="multilevel"/>
+    <w:tmpl w:val="C16A7D00"/>
+    <w:lvl w:ilvl="0">
+      <w:start w:val="1"/>
+      <w:numFmt w:val="bullet"/>
+      <w:lvlText w:val=""/>
+      <w:lvlJc w:val="left"/>
+      <w:pPr>
+        <w:tabs>
+          <w:tab w:val="num" w:pos="720"/>
+        </w:tabs>
+        <w:ind w:left="720" w:hanging="360"/>
+      </w:pPr>
+      <w:rPr>
+        <w:rFonts w:ascii="Symbol" w:hAnsi="Symbol" w:hint="default"/>
+        <w:sz w:val="20"/>
+      </w:rPr>
+    </w:lvl>
+    <w:lvl w:ilvl="1" w:tentative="1">
+      <w:start w:val="1"/>
+      <w:numFmt w:val="bullet"/>
+      <w:lvlText w:val="o"/>
+      <w:lvlJc w:val="left"/>
+      <w:pPr>
+        <w:tabs>
+          <w:tab w:val="num" w:pos="1440"/>
+        </w:tabs>
+        <w:ind w:left="1440" w:hanging="360"/>
+      </w:pPr>
+      <w:rPr>
+        <w:rFonts w:ascii="Courier New" w:hAnsi="Courier New" w:hint="default"/>
+        <w:sz w:val="20"/>
+      </w:rPr>
+    </w:lvl>
+    <w:lvl w:ilvl="2" w:tentative="1">
+      <w:start w:val="1"/>
+      <w:numFmt w:val="bullet"/>
+      <w:lvlText w:val=""/>
+      <w:lvlJc w:val="left"/>
+      <w:pPr>
+        <w:tabs>
+          <w:tab w:val="num" w:pos="2160"/>
+        </w:tabs>
+        <w:ind w:left="2160" w:hanging="360"/>
+      </w:pPr>
+      <w:rPr>
+        <w:rFonts w:ascii="Wingdings" w:hAnsi="Wingdings" w:hint="default"/>
+        <w:sz w:val="20"/>
+      </w:rPr>
+    </w:lvl>
+    <w:lvl w:ilvl="3" w:tentative="1">
+      <w:start w:val="1"/>
+      <w:numFmt w:val="bullet"/>
+      <w:lvlText w:val=""/>
+      <w:lvlJc w:val="left"/>
+      <w:pPr>
+        <w:tabs>
+          <w:tab w:val="num" w:pos="2880"/>
+        </w:tabs>
+        <w:ind w:left="2880" w:hanging="360"/>
+      </w:pPr>
+      <w:rPr>
+        <w:rFonts w:ascii="Wingdings" w:hAnsi="Wingdings" w:hint="default"/>
+        <w:sz w:val="20"/>
+      </w:rPr>
+    </w:lvl>
+    <w:lvl w:ilvl="4" w:tentative="1">
+      <w:start w:val="1"/>
+      <w:numFmt w:val="bullet"/>
+      <w:lvlText w:val=""/>
+      <w:lvlJc w:val="left"/>
+      <w:pPr>
+        <w:tabs>
+          <w:tab w:val="num" w:pos="3600"/>
+        </w:tabs>
+        <w:ind w:left="3600" w:hanging="360"/>
+      </w:pPr>
+      <w:rPr>
+        <w:rFonts w:ascii="Wingdings" w:hAnsi="Wingdings" w:hint="default"/>
+        <w:sz w:val="20"/>
+      </w:rPr>
+    </w:lvl>
+    <w:lvl w:ilvl="5" w:tentative="1">
+      <w:start w:val="1"/>
+      <w:numFmt w:val="bullet"/>
+      <w:lvlText w:val=""/>
+      <w:lvlJc w:val="left"/>
+      <w:pPr>
+        <w:tabs>
+          <w:tab w:val="num" w:pos="4320"/>
+        </w:tabs>
+        <w:ind w:left="4320" w:hanging="360"/>
+      </w:pPr>
+      <w:rPr>
+        <w:rFonts w:ascii="Wingdings" w:hAnsi="Wingdings" w:hint="default"/>
+        <w:sz w:val="20"/>
+      </w:rPr>
+    </w:lvl>
+    <w:lvl w:ilvl="6" w:tentative="1">
+      <w:start w:val="1"/>
+      <w:numFmt w:val="bullet"/>
+      <w:lvlText w:val=""/>
+      <w:lvlJc w:val="left"/>
+      <w:pPr>
+        <w:tabs>
+          <w:tab w:val="num" w:pos="5040"/>
+        </w:tabs>
+        <w:ind w:left="5040" w:hanging="360"/>
+      </w:pPr>
+      <w:rPr>
+        <w:rFonts w:ascii="Wingdings" w:hAnsi="Wingdings" w:hint="default"/>
+        <w:sz w:val="20"/>
+      </w:rPr>
+    </w:lvl>
+    <w:lvl w:ilvl="7" w:tentative="1">
+      <w:start w:val="1"/>
+      <w:numFmt w:val="bullet"/>
+      <w:lvlText w:val=""/>
+      <w:lvlJc w:val="left"/>
+      <w:pPr>
+        <w:tabs>
+          <w:tab w:val="num" w:pos="5760"/>
+        </w:tabs>
+        <w:ind w:left="5760" w:hanging="360"/>
+      </w:pPr>
+      <w:rPr>
+        <w:rFonts w:ascii="Wingdings" w:hAnsi="Wingdings" w:hint="default"/>
+        <w:sz w:val="20"/>
+      </w:rPr>
+    </w:lvl>
+    <w:lvl w:ilvl="8" w:tentative="1">
+      <w:start w:val="1"/>
+      <w:numFmt w:val="bullet"/>
+      <w:lvlText w:val=""/>
+      <w:lvlJc w:val="left"/>
+      <w:pPr>
+        <w:tabs>
+          <w:tab w:val="num" w:pos="6480"/>
+        </w:tabs>
+        <w:ind w:left="6480" w:hanging="360"/>
+      </w:pPr>
+      <w:rPr>
+        <w:rFonts w:ascii="Wingdings" w:hAnsi="Wingdings" w:hint="default"/>
+        <w:sz w:val="20"/>
+      </w:rPr>
+    </w:lvl>
+  </w:abstractNum>
+  <w:abstractNum w:abstractNumId="10" w15:restartNumberingAfterBreak="0">
     <w:nsid w:val="72711F95"/>
     <w:multiLevelType w:val="singleLevel"/>
     <w:tmpl w:val="BE6257C8"/>
@@ -5825,7 +6368,7 @@
       </w:rPr>
     </w:lvl>
   </w:abstractNum>
-  <w:abstractNum w:abstractNumId="10" w15:restartNumberingAfterBreak="0">
+  <w:abstractNum w:abstractNumId="11" w15:restartNumberingAfterBreak="0">
     <w:nsid w:val="797E3A5D"/>
     <w:multiLevelType w:val="singleLevel"/>
     <w:tmpl w:val="88107652"/>
@@ -5844,7 +6387,10 @@
     </w:lvl>
   </w:abstractNum>
   <w:num w:numId="1">
-    <w:abstractNumId w:val="10"/>
+    <w:abstractNumId w:val="11"/>
+  </w:num>
+  <w:num w:numId="2">
+    <w:abstractNumId w:val="9"/>
   </w:num>
 </w:numbering>
 </file>
@@ -6134,11 +6680,6 @@
     <w:lsdException w:name="Book Title" w:uiPriority="33" w:qFormat="1"/>
     <w:lsdException w:name="Bibliography" w:semiHidden="1" w:uiPriority="37" w:unhideWhenUsed="1"/>
     <w:lsdException w:name="TOC Heading" w:semiHidden="1" w:uiPriority="39" w:unhideWhenUsed="1" w:qFormat="1"/>
-    <w:lsdException w:name="Plain Table 5" w:semiHidden="1" w:unhideWhenUsed="1"/>
-    <w:lsdException w:name="Grid Table Light" w:semiHidden="1" w:unhideWhenUsed="1"/>
-    <w:lsdException w:name="Grid Table 1 Light" w:semiHidden="1" w:unhideWhenUsed="1"/>
-    <w:lsdException w:name="Grid Table 2" w:semiHidden="1" w:unhideWhenUsed="1"/>
-    <w:lsdException w:name="Grid Table 3" w:semiHidden="1" w:unhideWhenUsed="1"/>
     <w:lsdException w:name="Grid Table 4" w:uiPriority="49"/>
     <w:lsdException w:name="Grid Table 5 Dark" w:uiPriority="50"/>
     <w:lsdException w:name="Grid Table 6 Colorful" w:uiPriority="51"/>
@@ -17255,6 +17796,86 @@
       <w:sz w:val="18"/>
     </w:rPr>
   </w:style>
+  <w:style w:type="paragraph" w:styleId="NormalWeb">
+    <w:name w:val="Normal (Web)"/>
+    <w:basedOn w:val="Normal"/>
+    <w:uiPriority w:val="99"/>
+    <w:semiHidden/>
+    <w:unhideWhenUsed/>
+    <w:rsid w:val="00822836"/>
+    <w:pPr>
+      <w:spacing w:before="100" w:beforeAutospacing="1" w:after="100" w:afterAutospacing="1" w:line="240" w:lineRule="auto"/>
+    </w:pPr>
+    <w:rPr>
+      <w:rFonts w:ascii="Times New Roman" w:eastAsia="Times New Roman" w:hAnsi="Times New Roman" w:cs="Times New Roman"/>
+      <w:sz w:val="24"/>
+      <w:szCs w:val="24"/>
+      <w:lang w:val="en-AE"/>
+    </w:rPr>
+  </w:style>
+  <w:style w:type="character" w:styleId="HTMLCode">
+    <w:name w:val="HTML Code"/>
+    <w:basedOn w:val="DefaultParagraphFont"/>
+    <w:uiPriority w:val="99"/>
+    <w:semiHidden/>
+    <w:unhideWhenUsed/>
+    <w:rsid w:val="00822836"/>
+    <w:rPr>
+      <w:rFonts w:ascii="Courier New" w:eastAsia="Times New Roman" w:hAnsi="Courier New" w:cs="Courier New"/>
+      <w:sz w:val="20"/>
+      <w:szCs w:val="20"/>
+    </w:rPr>
+  </w:style>
+  <w:style w:type="paragraph" w:styleId="HTMLPreformatted">
+    <w:name w:val="HTML Preformatted"/>
+    <w:basedOn w:val="Normal"/>
+    <w:link w:val="HTMLPreformattedChar"/>
+    <w:uiPriority w:val="99"/>
+    <w:semiHidden/>
+    <w:unhideWhenUsed/>
+    <w:rsid w:val="00822836"/>
+    <w:pPr>
+      <w:tabs>
+        <w:tab w:val="left" w:pos="916"/>
+        <w:tab w:val="left" w:pos="1832"/>
+        <w:tab w:val="left" w:pos="2748"/>
+        <w:tab w:val="left" w:pos="3664"/>
+        <w:tab w:val="left" w:pos="4580"/>
+        <w:tab w:val="left" w:pos="5496"/>
+        <w:tab w:val="left" w:pos="6412"/>
+        <w:tab w:val="left" w:pos="7328"/>
+        <w:tab w:val="left" w:pos="8244"/>
+        <w:tab w:val="left" w:pos="9160"/>
+        <w:tab w:val="left" w:pos="10076"/>
+        <w:tab w:val="left" w:pos="10992"/>
+        <w:tab w:val="left" w:pos="11908"/>
+        <w:tab w:val="left" w:pos="12824"/>
+        <w:tab w:val="left" w:pos="13740"/>
+        <w:tab w:val="left" w:pos="14656"/>
+      </w:tabs>
+      <w:spacing w:after="0" w:line="240" w:lineRule="auto"/>
+    </w:pPr>
+    <w:rPr>
+      <w:rFonts w:ascii="Courier New" w:eastAsia="Times New Roman" w:hAnsi="Courier New" w:cs="Courier New"/>
+      <w:sz w:val="20"/>
+      <w:szCs w:val="20"/>
+      <w:lang w:val="en-AE"/>
+    </w:rPr>
+  </w:style>
+  <w:style w:type="character" w:customStyle="1" w:styleId="HTMLPreformattedChar">
+    <w:name w:val="HTML Preformatted Char"/>
+    <w:basedOn w:val="DefaultParagraphFont"/>
+    <w:link w:val="HTMLPreformatted"/>
+    <w:uiPriority w:val="99"/>
+    <w:semiHidden/>
+    <w:rsid w:val="00822836"/>
+    <w:rPr>
+      <w:rFonts w:ascii="Courier New" w:eastAsia="Times New Roman" w:hAnsi="Courier New" w:cs="Courier New"/>
+      <w:sz w:val="20"/>
+      <w:szCs w:val="20"/>
+      <w:lang w:val="en-AE"/>
+    </w:rPr>
+  </w:style>
 </w:styles>
 </file>
 

</xml_diff>